<commit_message>
updated doc and renamed
</commit_message>
<xml_diff>
--- a/doc/PozadavkyPGRF1_Task1_2026.docx
+++ b/doc/PozadavkyPGRF1_Task1_2026.docx
@@ -2101,7 +2101,37 @@
                 <w:szCs w:val="20"/>
                 <w:lang w:val="cs-CZ" w:eastAsia="cs-CZ" w:bidi="ar-SA"/>
               </w:rPr>
-              <w:t>Pravým kliknutím u bodu, pokud není okolo bodu tak ukazuje jak by bod vypadal</w:t>
+              <w:t xml:space="preserve">Pravým </w:t>
+            </w:r>
+            <w:r>
+              <w:rPr>
+                <w:rFonts w:eastAsia="Times New Roman" w:cs="Times New Roman" w:ascii="Times New Roman" w:hAnsi="Times New Roman"/>
+                <w:kern w:val="0"/>
+                <w:sz w:val="20"/>
+                <w:szCs w:val="20"/>
+                <w:lang w:val="cs-CZ" w:eastAsia="cs-CZ" w:bidi="ar-SA"/>
+              </w:rPr>
+              <w:t>tažením</w:t>
+            </w:r>
+            <w:r>
+              <w:rPr>
+                <w:rFonts w:eastAsia="Times New Roman" w:cs="Times New Roman" w:ascii="Times New Roman" w:hAnsi="Times New Roman"/>
+                <w:kern w:val="0"/>
+                <w:sz w:val="20"/>
+                <w:szCs w:val="20"/>
+                <w:lang w:val="cs-CZ" w:eastAsia="cs-CZ" w:bidi="ar-SA"/>
+              </w:rPr>
+              <w:t xml:space="preserve"> u bodu, pokud není okolo bodu tak ukazuje jak by vypadal </w:t>
+            </w:r>
+            <w:r>
+              <w:rPr>
+                <w:rFonts w:eastAsia="Times New Roman" w:cs="Times New Roman" w:ascii="Times New Roman" w:hAnsi="Times New Roman"/>
+                <w:kern w:val="0"/>
+                <w:sz w:val="20"/>
+                <w:szCs w:val="20"/>
+                <w:lang w:val="cs-CZ" w:eastAsia="cs-CZ" w:bidi="ar-SA"/>
+              </w:rPr>
+              <w:t>nový bod</w:t>
             </w:r>
           </w:p>
         </w:tc>

</xml_diff>